<commit_message>
Add GitHub repository link to Retail Intelligence Documentation
</commit_message>
<xml_diff>
--- a/outputs/Retail_Intelligence_Documentation.docx
+++ b/outputs/Retail_Intelligence_Documentation.docx
@@ -556,6 +556,8 @@
       <w:pPr>
         <w:spacing w:line="240" w:lineRule="auto"/>
         <w:rPr>
+          <w:b/>
+          <w:bCs/>
           <w:color w:val="000000" w:themeColor="text1"/>
           <w:sz w:val="24"/>
           <w:szCs w:val="24"/>
@@ -585,6 +587,82 @@
         </w:rPr>
         <w:t xml:space="preserve"> Mohamed </w:t>
       </w:r>
+    </w:p>
+    <w:p>
+      <w:pPr>
+        <w:spacing w:line="240" w:lineRule="auto"/>
+        <w:rPr>
+          <w:b/>
+          <w:bCs/>
+          <w:color w:val="000000" w:themeColor="text1"/>
+          <w:sz w:val="24"/>
+          <w:szCs w:val="24"/>
+        </w:rPr>
+      </w:pPr>
+    </w:p>
+    <w:p>
+      <w:pPr>
+        <w:spacing w:line="240" w:lineRule="auto"/>
+        <w:rPr>
+          <w:b/>
+          <w:bCs/>
+          <w:color w:val="000000" w:themeColor="text1"/>
+          <w:sz w:val="24"/>
+          <w:szCs w:val="24"/>
+        </w:rPr>
+      </w:pPr>
+      <w:r>
+        <w:rPr>
+          <w:b/>
+          <w:bCs/>
+          <w:color w:val="000000" w:themeColor="text1"/>
+          <w:sz w:val="24"/>
+          <w:szCs w:val="24"/>
+        </w:rPr>
+        <w:t xml:space="preserve">GitHub repo: </w:t>
+      </w:r>
+      <w:hyperlink r:id="rId8" w:history="1">
+        <w:r>
+          <w:rPr>
+            <w:rStyle w:val="Hyperlink"/>
+            <w:b/>
+            <w:bCs/>
+            <w:sz w:val="24"/>
+            <w:szCs w:val="24"/>
+          </w:rPr>
+          <w:t>https://github.com/MohamedElsadany56/Retail-Inte</w:t>
+        </w:r>
+        <w:r>
+          <w:rPr>
+            <w:rStyle w:val="Hyperlink"/>
+            <w:b/>
+            <w:bCs/>
+            <w:sz w:val="24"/>
+            <w:szCs w:val="24"/>
+          </w:rPr>
+          <w:t>l</w:t>
+        </w:r>
+        <w:r>
+          <w:rPr>
+            <w:rStyle w:val="Hyperlink"/>
+            <w:b/>
+            <w:bCs/>
+            <w:sz w:val="24"/>
+            <w:szCs w:val="24"/>
+          </w:rPr>
+          <w:t>ligence-DWH.git</w:t>
+        </w:r>
+      </w:hyperlink>
+    </w:p>
+    <w:p>
+      <w:pPr>
+        <w:spacing w:line="240" w:lineRule="auto"/>
+        <w:rPr>
+          <w:color w:val="000000" w:themeColor="text1"/>
+          <w:sz w:val="24"/>
+          <w:szCs w:val="24"/>
+        </w:rPr>
+      </w:pPr>
       <w:r>
         <w:rPr>
           <w:color w:val="000000" w:themeColor="text1"/>
@@ -12333,8 +12411,8 @@
       </w:r>
     </w:p>
     <w:sectPr>
-      <w:headerReference w:type="default" r:id="rId8"/>
-      <w:footerReference w:type="default" r:id="rId9"/>
+      <w:headerReference w:type="default" r:id="rId9"/>
+      <w:footerReference w:type="default" r:id="rId10"/>
       <w:pgSz w:w="12240" w:h="15840"/>
       <w:pgMar w:top="936" w:right="1008" w:bottom="936" w:left="1008" w:header="720" w:footer="720" w:gutter="0"/>
       <w:cols w:space="720"/>
@@ -24012,6 +24090,41 @@
       </w:tcPr>
     </w:tblStylePr>
   </w:style>
+  <w:style w:type="character" w:styleId="Hyperlink">
+    <w:name w:val="Hyperlink"/>
+    <w:basedOn w:val="DefaultParagraphFont"/>
+    <w:uiPriority w:val="99"/>
+    <w:unhideWhenUsed/>
+    <w:rsid w:val="00BF2FDD"/>
+    <w:rPr>
+      <w:color w:val="0000FF" w:themeColor="hyperlink"/>
+      <w:u w:val="single"/>
+    </w:rPr>
+  </w:style>
+  <w:style w:type="character" w:styleId="UnresolvedMention">
+    <w:name w:val="Unresolved Mention"/>
+    <w:basedOn w:val="DefaultParagraphFont"/>
+    <w:uiPriority w:val="99"/>
+    <w:semiHidden/>
+    <w:unhideWhenUsed/>
+    <w:rsid w:val="00BF2FDD"/>
+    <w:rPr>
+      <w:color w:val="605E5C"/>
+      <w:shd w:val="clear" w:color="auto" w:fill="E1DFDD"/>
+    </w:rPr>
+  </w:style>
+  <w:style w:type="character" w:styleId="FollowedHyperlink">
+    <w:name w:val="FollowedHyperlink"/>
+    <w:basedOn w:val="DefaultParagraphFont"/>
+    <w:uiPriority w:val="99"/>
+    <w:semiHidden/>
+    <w:unhideWhenUsed/>
+    <w:rsid w:val="00BF2FDD"/>
+    <w:rPr>
+      <w:color w:val="800080" w:themeColor="followedHyperlink"/>
+      <w:u w:val="single"/>
+    </w:rPr>
+  </w:style>
 </w:styles>
 </file>
 

</xml_diff>